<commit_message>
Regenerate this week's Signal under the new X counting
Wednesday's issue, rebuilt so the thread carries lengths counted the way
X counts them. The thread is otherwise identical: five posts in, five
posts out, nothing dropped. Post 5 reads 132 rather than 133 because the
link it carries is 24 characters charged at 23, which is the fix visible
in the output.

The note changes only in its capture stamp and one figure that moved with
the data, cross-asset correlation from 0.56 to 0.55.

Co-Authored-By: Claude Opus 5 (1M context) <noreply@anthropic.com>
</commit_message>
<xml_diff>
--- a/reports/signals/docx/levanter-signal-2026-08-31.docx
+++ b/reports/signals/docx/levanter-signal-2026-08-31.docx
@@ -41,7 +41,7 @@
         <w:rPr>
           <w:i/>
         </w:rPr>
-        <w:t>Data captured at 13:38 GST on 2 September 2026. Every figure below is stamped to a period. This is the accountable read behind the free weekly: the changes since last week, the levels to watch, and a claim we will score in the next issue.</w:t>
+        <w:t>Data captured at 16:22 GST on 2 September 2026. Every figure below is stamped to a period. This is the accountable read behind the free weekly: the changes since last week, the levels to watch, and a claim we will score in the next issue.</w:t>
       </w:r>
     </w:p>
     <w:p/>
@@ -89,7 +89,7 @@
     </w:p>
     <w:p>
       <w:r>
-        <w:t>Average cross-asset correlation is near 0.56. That is high enough that diversification is thin: position count is not the same as risk spread this week.</w:t>
+        <w:t>Average cross-asset correlation is near 0.55. That is high enough that diversification is thin: position count is not the same as risk spread this week.</w:t>
       </w:r>
     </w:p>
     <w:p>

</xml_diff>